<commit_message>
Align ABK Word questions with native numbering and inline layout
</commit_message>
<xml_diff>
--- a/templates/abk_tpl.docx
+++ b/templates/abk_tpl.docx
@@ -688,6 +688,7 @@
     <w:p>
       <w:pPr>
         <w:spacing w:before="120" w:after="60"/>
+        <w:keepNext/>
       </w:pPr>
       <w:r>
         <w:rPr>
@@ -697,13 +698,10 @@
         </w:rPr>
         <w:t xml:space="preserve">{title}</w:t>
       </w:r>
+    </w:p>
+    <w:p>
       <w:r>
-        <w:rPr>
-          <w:rFonts w:ascii="Times New Roman" w:hAnsi="Times New Roman" w:eastAsia="DFPYuanMedium-B5" w:hint="eastAsia"/>
-          <w:sz w:val="20"/>
-          <w:szCs w:val="20"/>
-        </w:rPr>
-        <w:t xml:space="preserve"> ／每題 XX 分，共 XX 分</w:t>
+        <w:t xml:space="preserve">{#items}</w:t>
       </w:r>
     </w:p>
     <w:p>
@@ -714,6 +712,7 @@
     <w:p>
       <w:pPr>
         <w:spacing w:after="120"/>
+        <w:keepNext/>
       </w:pPr>
       <w:r>
         <w:rPr>
@@ -742,24 +741,29 @@
       </w:r>
     </w:p>
     <w:p>
-      <w:r>
-        <w:t xml:space="preserve">{#items}</w:t>
-      </w:r>
-    </w:p>
-    <w:p>
-      <w:pPr>
-        <w:spacing w:after="140"/>
-        <w:ind w:left="480" w:hanging="480"/>
-      </w:pPr>
-      <w:r>
+      <w:pPr>
+        <w:pStyle w:val="ListParagraph"/>
+        <w:widowControl/>
+        <w:numPr>
+          <w:ilvl w:val="0"/>
+          <w:numId w:val="100"/>
+        </w:numPr>
+        <w:tabs>
+          <w:tab w:val="left" w:pos="0"/>
+          <w:tab w:val="left" w:pos="709"/>
+          <w:tab w:val="left" w:pos="1985"/>
+          <w:tab w:val="left" w:pos="3260"/>
+          <w:tab w:val="left" w:pos="4536"/>
+        </w:tabs>
+        <w:snapToGrid w:val="0"/>
+        <w:spacing w:after="120"/>
+        <w:ind w:left="567" w:hanging="425"/>
         <w:rPr>
-          <w:rFonts w:ascii="Times New Roman" w:hAnsi="Times New Roman" w:eastAsia="DFPYuanMedium-B5" w:hint="eastAsia"/>
-          <w:b/>
+          <w:rFonts w:ascii="Times New Roman" w:hAnsi="Times New Roman" w:eastAsia="DFPYuanMedium-B5"/>
           <w:sz w:val="20"/>
           <w:szCs w:val="20"/>
         </w:rPr>
-        <w:t xml:space="preserve">{no}. </w:t>
-      </w:r>
+      </w:pPr>
       <w:r>
         <w:rPr>
           <w:rFonts w:ascii="Times New Roman" w:hAnsi="Times New Roman" w:eastAsia="DFPYuanMedium-B5" w:hint="eastAsia"/>

</xml_diff>

<commit_message>
Use native Word numbering and score blanks for ABK sections
</commit_message>
<xml_diff>
--- a/templates/abk_tpl.docx
+++ b/templates/abk_tpl.docx
@@ -687,8 +687,22 @@
     </w:p>
     <w:p>
       <w:pPr>
-        <w:spacing w:before="120" w:after="60"/>
+        <w:pStyle w:val="ListParagraph"/>
         <w:keepNext/>
+        <w:numPr>
+          <w:ilvl w:val="0"/>
+          <w:numId w:val="87"/>
+        </w:numPr>
+        <w:tabs>
+          <w:tab w:val="left" w:pos="0"/>
+        </w:tabs>
+        <w:spacing w:after="120" w:line="288" w:lineRule="auto"/>
+        <w:ind w:left="284" w:hanging="567"/>
+        <w:rPr>
+          <w:rFonts w:eastAsia="DFPYuanMedium-B5"/>
+          <w:sz w:val="20"/>
+          <w:szCs w:val="20"/>
+        </w:rPr>
       </w:pPr>
       <w:r>
         <w:rPr>
@@ -697,6 +711,14 @@
           <w:szCs w:val="24"/>
         </w:rPr>
         <w:t xml:space="preserve">{title}</w:t>
+      </w:r>
+      <w:r>
+        <w:rPr>
+          <w:rFonts w:ascii="Times New Roman" w:hAnsi="Times New Roman" w:eastAsia="DFPYuanMedium-B5"/>
+          <w:sz w:val="20"/>
+          <w:szCs w:val="20"/>
+        </w:rPr>
+        <w:t xml:space="preserve">  /每題＿＿分，共＿＿分</w:t>
       </w:r>
     </w:p>
     <w:p>

</xml_diff>

<commit_message>
Box ABK group passages with native bullet numbering
</commit_message>
<xml_diff>
--- a/templates/abk_tpl.docx
+++ b/templates/abk_tpl.docx
@@ -688,7 +688,6 @@
     <w:p>
       <w:pPr>
         <w:pStyle w:val="ListParagraph"/>
-        <w:keepNext/>
         <w:numPr>
           <w:ilvl w:val="0"/>
           <w:numId w:val="87"/>
@@ -734,27 +733,78 @@
     <w:p>
       <w:pPr>
         <w:spacing w:after="120"/>
-        <w:keepNext/>
       </w:pPr>
       <w:r>
-        <w:rPr>
-          <w:rFonts w:ascii="Times New Roman" w:hAnsi="Times New Roman" w:eastAsia="DFPYuanMedium-B5" w:hint="eastAsia"/>
-          <w:sz w:val="20"/>
-          <w:szCs w:val="20"/>
-        </w:rPr>
-        <w:t xml:space="preserve">◎ {text}</w:t>
-      </w:r>
-      <w:r>
-        <w:t xml:space="preserve">{#imgs}</w:t>
-      </w:r>
-      <w:r>
-        <w:br/>
-      </w:r>
-      <w:r>
-        <w:t xml:space="preserve">{%src}</w:t>
-      </w:r>
-      <w:r>
-        <w:t xml:space="preserve">{/imgs}</w:t>
+        <w:drawing>
+          <wp:inline distT="0" distB="0" distL="0" distR="0">
+            <wp:extent cx="3500000" cy="1200000"/>
+            <wp:docPr id="9000001" name="Group Passage"/>
+            <wp:cNvGraphicFramePr/>
+            <ns0:graphic xmlns:ns0="http://schemas.openxmlformats.org/drawingml/2006/main">
+              <ns0:graphicData uri="http://schemas.microsoft.com/office/word/2010/wordprocessingShape">
+                <wps:wsp>
+                  <wps:cNvSpPr txBox="1"/>
+                  <wps:spPr>
+                    <ns0:xfrm>
+                      <ns0:off x="0" y="0"/>
+                      <ns0:ext cx="3500000" cy="1200000"/>
+                    </ns0:xfrm>
+                    <ns0:prstGeom prst="rect">
+                      <ns0:avLst/>
+                    </ns0:prstGeom>
+                    <ns0:noFill/>
+                    <ns0:ln w="6350">
+                      <ns0:solidFill>
+                        <ns0:prstClr val="black"/>
+                      </ns0:solidFill>
+                    </ns0:ln>
+                  </wps:spPr>
+                  <wps:txbx>
+                    <w:txbxContent>
+                      <w:p>
+                        <w:pPr>
+                          <w:pStyle w:val="ListParagraph"/>
+                          <w:numPr>
+                            <w:ilvl w:val="0"/>
+                            <w:numId w:val="108"/>
+                          </w:numPr>
+                          <w:tabs>
+                            <w:tab w:val="left" w:pos="0"/>
+                          </w:tabs>
+                          <w:spacing w:after="0"/>
+                          <w:ind w:left="284" w:hanging="284"/>
+                        </w:pPr>
+                        <w:r>
+                          <w:rPr>
+                            <w:rFonts w:ascii="Times New Roman" w:hAnsi="Times New Roman" w:eastAsia="DFPYuanMedium-B5" w:hint="eastAsia"/>
+                            <w:sz w:val="20"/>
+                            <w:szCs w:val="20"/>
+                          </w:rPr>
+                          <w:t xml:space="preserve">{text}</w:t>
+                        </w:r>
+                        <w:r>
+                          <w:t xml:space="preserve">{#imgs}</w:t>
+                        </w:r>
+                        <w:r>
+                          <w:br/>
+                        </w:r>
+                        <w:r>
+                          <w:t xml:space="preserve">{%src}</w:t>
+                        </w:r>
+                        <w:r>
+                          <w:t xml:space="preserve">{/imgs}</w:t>
+                        </w:r>
+                      </w:p>
+                    </w:txbxContent>
+                  </wps:txbx>
+                  <wps:bodyPr rot="0" vert="horz" wrap="square" lIns="91440" tIns="45720" rIns="91440" bIns="45720">
+                    <ns0:spAutoFit/>
+                  </wps:bodyPr>
+                </wps:wsp>
+              </ns0:graphicData>
+            </ns0:graphic>
+          </wp:inline>
+        </w:drawing>
       </w:r>
     </w:p>
     <w:p>
@@ -10638,6 +10688,23 @@
       </w:pPr>
     </w:lvl>
   </w:abstractNum>
+  <w:abstractNum w:abstractNumId="101">
+    <w:multiLevelType w:val="singleLevel"/>
+    <w:lvl w:ilvl="0">
+      <w:start w:val="1"/>
+      <w:numFmt w:val="bullet"/>
+      <w:lvlText w:val="◎"/>
+      <w:lvlJc w:val="left"/>
+      <w:suff w:val="space"/>
+      <w:pPr>
+        <w:ind w:left="284" w:hanging="284"/>
+      </w:pPr>
+      <w:rPr>
+        <w:rFonts w:eastAsia="DFPYuanMedium-B5"/>
+        <w:sz w:val="20"/>
+      </w:rPr>
+    </w:lvl>
+  </w:abstractNum>
   <w:num w:numId="1" w16cid:durableId="1486161847">
     <w:abstractNumId w:val="40"/>
   </w:num>
@@ -10973,6 +11040,9 @@
   </w:num>
   <w:num w:numId="105" w16cid:durableId="1020473790">
     <w:abstractNumId w:val="7"/>
+  </w:num>
+  <w:num w:numId="108">
+    <w:abstractNumId w:val="101"/>
   </w:num>
 </w:numbering>
 </file>

</xml_diff>

<commit_message>
Match ABK passage box width and body paragraph settings
</commit_message>
<xml_diff>
--- a/templates/abk_tpl.docx
+++ b/templates/abk_tpl.docx
@@ -737,7 +737,7 @@
       <w:r>
         <w:drawing>
           <wp:inline distT="0" distB="0" distL="0" distR="0">
-            <wp:extent cx="3500000" cy="1200000"/>
+            <wp:extent cx="3967200" cy="2059200"/>
             <wp:docPr id="9000001" name="Group Passage"/>
             <wp:cNvGraphicFramePr/>
             <ns0:graphic xmlns:ns0="http://schemas.openxmlformats.org/drawingml/2006/main">
@@ -747,7 +747,7 @@
                   <wps:spPr>
                     <ns0:xfrm>
                       <ns0:off x="0" y="0"/>
-                      <ns0:ext cx="3500000" cy="1200000"/>
+                      <ns0:ext cx="3967200" cy="2059200"/>
                     </ns0:xfrm>
                     <ns0:prstGeom prst="rect">
                       <ns0:avLst/>
@@ -771,8 +771,14 @@
                           <w:tabs>
                             <w:tab w:val="left" w:pos="0"/>
                           </w:tabs>
-                          <w:spacing w:after="0"/>
-                          <w:ind w:left="284" w:hanging="284"/>
+                          <w:adjustRightInd w:val="1"/>
+                          <w:snapToGrid w:val="0"/>
+                          <w:spacing w:before="0" w:after="120" w:line="240" w:lineRule="auto"/>
+                          <w:ind w:left="142" w:right="0" w:hanging="425"/>
+                          <w:contextualSpacing w:val="0"/>
+                          <w:mirrorIndents w:val="0"/>
+                          <w:jc w:val="left"/>
+                          <w:outlineLvl w:val="9"/>
                         </w:pPr>
                         <w:r>
                           <w:rPr>
@@ -797,7 +803,7 @@
                       </w:p>
                     </w:txbxContent>
                   </wps:txbx>
-                  <wps:bodyPr rot="0" vert="horz" wrap="square" lIns="91440" tIns="45720" rIns="91440" bIns="45720">
+                  <wps:bodyPr rot="0" vert="horz" wrap="square" lIns="270000" tIns="45720" rIns="91440" bIns="45720">
                     <ns0:spAutoFit/>
                   </wps:bodyPr>
                 </wps:wsp>
@@ -827,9 +833,14 @@
           <w:tab w:val="left" w:pos="3260"/>
           <w:tab w:val="left" w:pos="4536"/>
         </w:tabs>
+        <w:adjustRightInd w:val="1"/>
         <w:snapToGrid w:val="0"/>
-        <w:spacing w:after="120"/>
-        <w:ind w:left="567" w:hanging="425"/>
+        <w:spacing w:before="0" w:after="120" w:line="240" w:lineRule="auto"/>
+        <w:ind w:left="142" w:right="0" w:hanging="425"/>
+        <w:contextualSpacing w:val="0"/>
+        <w:mirrorIndents w:val="0"/>
+        <w:jc w:val="left"/>
+        <w:outlineLvl w:val="9"/>
         <w:rPr>
           <w:rFonts w:ascii="Times New Roman" w:hAnsi="Times New Roman" w:eastAsia="DFPYuanMedium-B5"/>
           <w:sz w:val="20"/>

</xml_diff>